<commit_message>
Update files for final UM Rev. 3 This version was submitted to NQA1 document repository for VERA 4.0-RC7 release
</commit_message>
<xml_diff>
--- a/verain/docs/latex/casl/cover.docx
+++ b/verain/docs/latex/casl/cover.docx
@@ -5002,8 +5002,6 @@
           <w:szCs w:val="22"/>
         </w:rPr>
       </w:pPr>
-      <w:bookmarkStart w:id="1" w:name="_GoBack"/>
-      <w:bookmarkEnd w:id="1"/>
     </w:p>
     <w:tbl>
       <w:tblPr>
@@ -5458,6 +5456,40 @@
                 <w:szCs w:val="22"/>
               </w:rPr>
             </w:pPr>
+            <w:r>
+              <w:rPr>
+                <w:rFonts w:ascii="Arial" w:eastAsia="Arial Unicode MS" w:hAnsi="Arial" w:cs="Arial"/>
+                <w:bCs/>
+                <w:iCs/>
+                <w:snapToGrid/>
+                <w:szCs w:val="22"/>
+              </w:rPr>
+              <w:t xml:space="preserve">Brendan </w:t>
+            </w:r>
+            <w:proofErr w:type="spellStart"/>
+            <w:r>
+              <w:rPr>
+                <w:rFonts w:ascii="Arial" w:eastAsia="Arial Unicode MS" w:hAnsi="Arial" w:cs="Arial"/>
+                <w:bCs/>
+                <w:iCs/>
+                <w:snapToGrid/>
+                <w:szCs w:val="22"/>
+              </w:rPr>
+              <w:t>Kochunas</w:t>
+            </w:r>
+            <w:proofErr w:type="spellEnd"/>
+            <w:r>
+              <w:rPr>
+                <w:rFonts w:ascii="Arial" w:eastAsia="Arial Unicode MS" w:hAnsi="Arial" w:cs="Arial"/>
+                <w:bCs/>
+                <w:iCs/>
+                <w:snapToGrid/>
+                <w:szCs w:val="22"/>
+              </w:rPr>
+              <w:t xml:space="preserve">, </w:t>
+            </w:r>
+            <w:bookmarkStart w:id="1" w:name="_GoBack"/>
+            <w:bookmarkEnd w:id="1"/>
             <w:r>
               <w:rPr>
                 <w:rFonts w:ascii="Arial" w:eastAsia="Arial Unicode MS" w:hAnsi="Arial" w:cs="Arial"/>
@@ -8815,6 +8847,25 @@
 </file>
 
 <file path=customXml/item1.xml><?xml version="1.0" encoding="utf-8"?>
+<?mso-contentType ?>
+<FormTemplates xmlns="http://schemas.microsoft.com/sharepoint/v3/contenttype/forms">
+  <Display>DocumentLibraryForm</Display>
+  <Edit>DocumentLibraryForm</Edit>
+  <New>DocumentLibraryForm</New>
+</FormTemplates>
+</file>
+
+<file path=customXml/item2.xml><?xml version="1.0" encoding="utf-8"?>
+<p:properties xmlns:p="http://schemas.microsoft.com/office/2006/metadata/properties" xmlns:xsi="http://www.w3.org/2001/XMLSchema-instance" xmlns:pc="http://schemas.microsoft.com/office/infopath/2007/PartnerControls">
+  <documentManagement>
+    <IconOverlay xmlns="http://schemas.microsoft.com/sharepoint/v4" xsi:nil="true"/>
+    <AxSourceListID xmlns="2df79c4b-422a-4389-bee9-4052db243df7" xsi:nil="true"/>
+    <AxSourceItemID xmlns="2df79c4b-422a-4389-bee9-4052db243df7" xsi:nil="true"/>
+  </documentManagement>
+</p:properties>
+</file>
+
+<file path=customXml/item3.xml><?xml version="1.0" encoding="utf-8"?>
 <ct:contentTypeSchema xmlns:ct="http://schemas.microsoft.com/office/2006/metadata/contentType" xmlns:ma="http://schemas.microsoft.com/office/2006/metadata/properties/metaAttributes" ct:_="" ma:_="" ma:contentTypeName="Document" ma:contentTypeID="0x010100736BE9B5A985734A847479BB3367DB52" ma:contentTypeVersion="4" ma:contentTypeDescription="Create a new document." ma:contentTypeScope="" ma:versionID="498ed53d1c82b145cd9a82d443a6efce">
   <xsd:schema xmlns:xsd="http://www.w3.org/2001/XMLSchema" xmlns:xs="http://www.w3.org/2001/XMLSchema" xmlns:p="http://schemas.microsoft.com/office/2006/metadata/properties" xmlns:ns2="2df79c4b-422a-4389-bee9-4052db243df7" xmlns:ns3="http://schemas.microsoft.com/sharepoint/v4" targetNamespace="http://schemas.microsoft.com/office/2006/metadata/properties" ma:root="true" ma:fieldsID="246148f0a1c058b8f4e618a7dc08c8a1" ns2:_="" ns3:_="">
     <xsd:import namespace="2df79c4b-422a-4389-bee9-4052db243df7"/>
@@ -8957,30 +9008,30 @@
 </ct:contentTypeSchema>
 </file>
 
-<file path=customXml/item2.xml><?xml version="1.0" encoding="utf-8"?>
-<p:properties xmlns:p="http://schemas.microsoft.com/office/2006/metadata/properties" xmlns:xsi="http://www.w3.org/2001/XMLSchema-instance" xmlns:pc="http://schemas.microsoft.com/office/infopath/2007/PartnerControls">
-  <documentManagement>
-    <IconOverlay xmlns="http://schemas.microsoft.com/sharepoint/v4" xsi:nil="true"/>
-    <AxSourceListID xmlns="2df79c4b-422a-4389-bee9-4052db243df7" xsi:nil="true"/>
-    <AxSourceItemID xmlns="2df79c4b-422a-4389-bee9-4052db243df7" xsi:nil="true"/>
-  </documentManagement>
-</p:properties>
-</file>
-
-<file path=customXml/item3.xml><?xml version="1.0" encoding="utf-8"?>
-<?mso-contentType ?>
-<FormTemplates xmlns="http://schemas.microsoft.com/sharepoint/v3/contenttype/forms">
-  <Display>DocumentLibraryForm</Display>
-  <Edit>DocumentLibraryForm</Edit>
-  <New>DocumentLibraryForm</New>
-</FormTemplates>
-</file>
-
 <file path=customXml/item4.xml><?xml version="1.0" encoding="utf-8"?>
 <b:Sources xmlns:b="http://schemas.openxmlformats.org/officeDocument/2006/bibliography" xmlns="http://schemas.openxmlformats.org/officeDocument/2006/bibliography" SelectedStyle="\APA.XSL" StyleName="APA"/>
 </file>
 
 <file path=customXml/itemProps1.xml><?xml version="1.0" encoding="utf-8"?>
+<ds:datastoreItem xmlns:ds="http://schemas.openxmlformats.org/officeDocument/2006/customXml" ds:itemID="{C9B4D2A0-8AA5-4FEC-B315-C34E9751B97C}">
+  <ds:schemaRefs>
+    <ds:schemaRef ds:uri="http://schemas.microsoft.com/sharepoint/v3/contenttype/forms"/>
+  </ds:schemaRefs>
+</ds:datastoreItem>
+</file>
+
+<file path=customXml/itemProps2.xml><?xml version="1.0" encoding="utf-8"?>
+<ds:datastoreItem xmlns:ds="http://schemas.openxmlformats.org/officeDocument/2006/customXml" ds:itemID="{D426956D-E14D-414F-869A-3689EA34EC47}">
+  <ds:schemaRefs>
+    <ds:schemaRef ds:uri="http://schemas.microsoft.com/office/2006/metadata/properties"/>
+    <ds:schemaRef ds:uri="http://schemas.microsoft.com/office/infopath/2007/PartnerControls"/>
+    <ds:schemaRef ds:uri="http://schemas.microsoft.com/sharepoint/v4"/>
+    <ds:schemaRef ds:uri="2df79c4b-422a-4389-bee9-4052db243df7"/>
+  </ds:schemaRefs>
+</ds:datastoreItem>
+</file>
+
+<file path=customXml/itemProps3.xml><?xml version="1.0" encoding="utf-8"?>
 <ds:datastoreItem xmlns:ds="http://schemas.openxmlformats.org/officeDocument/2006/customXml" ds:itemID="{6E118B79-CD8D-4DD4-A53B-98A077F090ED}">
   <ds:schemaRefs>
     <ds:schemaRef ds:uri="http://schemas.microsoft.com/office/2006/metadata/contentType"/>
@@ -8999,27 +9050,8 @@
 </ds:datastoreItem>
 </file>
 
-<file path=customXml/itemProps2.xml><?xml version="1.0" encoding="utf-8"?>
-<ds:datastoreItem xmlns:ds="http://schemas.openxmlformats.org/officeDocument/2006/customXml" ds:itemID="{D426956D-E14D-414F-869A-3689EA34EC47}">
-  <ds:schemaRefs>
-    <ds:schemaRef ds:uri="http://schemas.microsoft.com/office/2006/metadata/properties"/>
-    <ds:schemaRef ds:uri="http://schemas.microsoft.com/office/infopath/2007/PartnerControls"/>
-    <ds:schemaRef ds:uri="http://schemas.microsoft.com/sharepoint/v4"/>
-    <ds:schemaRef ds:uri="2df79c4b-422a-4389-bee9-4052db243df7"/>
-  </ds:schemaRefs>
-</ds:datastoreItem>
-</file>
-
-<file path=customXml/itemProps3.xml><?xml version="1.0" encoding="utf-8"?>
-<ds:datastoreItem xmlns:ds="http://schemas.openxmlformats.org/officeDocument/2006/customXml" ds:itemID="{C9B4D2A0-8AA5-4FEC-B315-C34E9751B97C}">
-  <ds:schemaRefs>
-    <ds:schemaRef ds:uri="http://schemas.microsoft.com/sharepoint/v3/contenttype/forms"/>
-  </ds:schemaRefs>
-</ds:datastoreItem>
-</file>
-
 <file path=customXml/itemProps4.xml><?xml version="1.0" encoding="utf-8"?>
-<ds:datastoreItem xmlns:ds="http://schemas.openxmlformats.org/officeDocument/2006/customXml" ds:itemID="{D77D9DB2-31F5-445D-A60F-05C8C75028E0}">
+<ds:datastoreItem xmlns:ds="http://schemas.openxmlformats.org/officeDocument/2006/customXml" ds:itemID="{924E4EEB-484E-4E9F-B68A-0451C08DF4BE}">
   <ds:schemaRefs>
     <ds:schemaRef ds:uri="http://schemas.openxmlformats.org/officeDocument/2006/bibliography"/>
   </ds:schemaRefs>

</xml_diff>